<commit_message>
TIS_hardware_compare_RobastDB_GI cleanup with ini and  "tis_gap_app.ini" >> .gitignore
</commit_message>
<xml_diff>
--- a/info/docs/github/github_git_cycle.docx
+++ b/info/docs/github/github_git_cycle.docx
@@ -3,59 +3,293 @@
 <w:document xmlns:wpc="http://schemas.microsoft.com/office/word/2010/wordprocessingCanvas" xmlns:cx="http://schemas.microsoft.com/office/drawing/2014/chartex" xmlns:cx1="http://schemas.microsoft.com/office/drawing/2015/9/8/chartex" xmlns:cx2="http://schemas.microsoft.com/office/drawing/2015/10/21/chartex" xmlns:cx3="http://schemas.microsoft.com/office/drawing/2016/5/9/chartex" xmlns:cx4="http://schemas.microsoft.com/office/drawing/2016/5/10/chartex" xmlns:cx5="http://schemas.microsoft.com/office/drawing/2016/5/11/chartex" xmlns:cx6="http://schemas.microsoft.com/office/drawing/2016/5/12/chartex" xmlns:cx7="http://schemas.microsoft.com/office/drawing/2016/5/13/chartex" xmlns:cx8="http://schemas.microsoft.com/office/drawing/2016/5/14/chartex" xmlns:mc="http://schemas.openxmlformats.org/markup-compatibility/2006" xmlns:aink="http://schemas.microsoft.com/office/drawing/2016/ink" xmlns:am3d="http://schemas.microsoft.com/office/drawing/2017/model3d" xmlns:o="urn:schemas-microsoft-com:office:office" xmlns:oel="http://schemas.microsoft.com/office/2019/extlst" xmlns:r="http://schemas.openxmlformats.org/officeDocument/2006/relationships" xmlns:m="http://schemas.openxmlformats.org/officeDocument/2006/math" xmlns:v="urn:schemas-microsoft-com:vml" xmlns:wp14="http://schemas.microsoft.com/office/word/2010/wordprocessingDrawing" xmlns:wp="http://schemas.openxmlformats.org/drawingml/2006/wordprocessingDrawing" xmlns:w10="urn:schemas-microsoft-com:office:word" xmlns:w="http://schemas.openxmlformats.org/wordprocessingml/2006/main" xmlns:w14="http://schemas.microsoft.com/office/word/2010/wordml" xmlns:w15="http://schemas.microsoft.com/office/word/2012/wordml" xmlns:w16cex="http://schemas.microsoft.com/office/word/2018/wordml/cex" xmlns:w16cid="http://schemas.microsoft.com/office/word/2016/wordml/cid" xmlns:w16="http://schemas.microsoft.com/office/word/2018/wordml" xmlns:w16du="http://schemas.microsoft.com/office/word/2023/wordml/word16du" xmlns:w16sdtdh="http://schemas.microsoft.com/office/word/2020/wordml/sdtdatahash" xmlns:w16sdtfl="http://schemas.microsoft.com/office/word/2024/wordml/sdtformatlock" xmlns:w16se="http://schemas.microsoft.com/office/word/2015/wordml/symex" xmlns:wpg="http://schemas.microsoft.com/office/word/2010/wordprocessingGroup" xmlns:wpi="http://schemas.microsoft.com/office/word/2010/wordprocessingInk" xmlns:wne="http://schemas.microsoft.com/office/word/2006/wordml" xmlns:wps="http://schemas.microsoft.com/office/word/2010/wordprocessingShape" mc:Ignorable="w14 w15 w16se w16cid w16 w16cex w16sdtdh w16sdtfl w16du wp14">
   <w:body>
     <w:p>
+      <w:pPr>
+        <w:pStyle w:val="NoSpacing"/>
+      </w:pPr>
+      <w:r>
+        <w:t xml:space="preserve"># verify </w:t>
+      </w:r>
+      <w:proofErr w:type="spellStart"/>
+      <w:r>
+        <w:t>ini</w:t>
+      </w:r>
+      <w:proofErr w:type="spellEnd"/>
+      <w:r>
+        <w:t xml:space="preserve"> is ignored</w:t>
+      </w:r>
+    </w:p>
+    <w:p>
+      <w:pPr>
+        <w:pStyle w:val="NoSpacing"/>
+      </w:pPr>
+      <w:r>
+        <w:t>git status</w:t>
+      </w:r>
+    </w:p>
+    <w:p>
+      <w:pPr>
+        <w:pStyle w:val="NoSpacing"/>
+      </w:pPr>
+    </w:p>
+    <w:p>
+      <w:pPr>
+        <w:pStyle w:val="NoSpacing"/>
+      </w:pPr>
       <w:r>
         <w:t>git pull origin dev</w:t>
       </w:r>
     </w:p>
     <w:p>
+      <w:pPr>
+        <w:pStyle w:val="NoSpacing"/>
+      </w:pPr>
       <w:r>
         <w:t>git add .</w:t>
       </w:r>
     </w:p>
     <w:p>
+      <w:pPr>
+        <w:pStyle w:val="NoSpacing"/>
+      </w:pPr>
       <w:r>
         <w:t>git commit -m "your message here"</w:t>
       </w:r>
     </w:p>
     <w:p>
+      <w:pPr>
+        <w:pStyle w:val="NoSpacing"/>
+      </w:pPr>
       <w:r>
         <w:t>git push origin dev</w:t>
       </w:r>
     </w:p>
     <w:p>
+      <w:pPr>
+        <w:pStyle w:val="NoSpacing"/>
+      </w:pPr>
       <w:r>
         <w:t>git status</w:t>
       </w:r>
     </w:p>
     <w:p>
-      <w:r>
-        <w:t>git log --oneline -5</w:t>
-      </w:r>
-    </w:p>
-    <w:p>
+      <w:pPr>
+        <w:pStyle w:val="NoSpacing"/>
+      </w:pPr>
+      <w:r>
+        <w:t>git log --</w:t>
+      </w:r>
+      <w:proofErr w:type="spellStart"/>
+      <w:r>
+        <w:t>oneline</w:t>
+      </w:r>
+      <w:proofErr w:type="spellEnd"/>
+      <w:r>
+        <w:t xml:space="preserve"> -5</w:t>
+      </w:r>
+    </w:p>
+    <w:p>
+      <w:pPr>
+        <w:pStyle w:val="NoSpacing"/>
+      </w:pPr>
       <w:r>
         <w:t>git add .</w:t>
       </w:r>
     </w:p>
     <w:p>
-      <w:r>
-        <w:t>git commit -m "</w:t>
-      </w:r>
-      <w:r>
-        <w:t>adding ini and git info</w:t>
-      </w:r>
-      <w:r>
-        <w:t>"</w:t>
-      </w:r>
-    </w:p>
-    <w:p>
+      <w:pPr>
+        <w:pStyle w:val="NoSpacing"/>
+      </w:pPr>
+      <w:r>
+        <w:t xml:space="preserve">git commit -m "adding </w:t>
+      </w:r>
+      <w:proofErr w:type="spellStart"/>
+      <w:r>
+        <w:t>ini</w:t>
+      </w:r>
+      <w:proofErr w:type="spellEnd"/>
+      <w:r>
+        <w:t xml:space="preserve"> and git info"</w:t>
+      </w:r>
+    </w:p>
+    <w:p>
+      <w:pPr>
+        <w:pStyle w:val="NoSpacing"/>
+      </w:pPr>
       <w:r>
         <w:t>git pull origin dev</w:t>
       </w:r>
     </w:p>
     <w:p>
+      <w:pPr>
+        <w:pStyle w:val="NoSpacing"/>
+      </w:pPr>
       <w:r>
         <w:t>git push origin dev</w:t>
+      </w:r>
+    </w:p>
+    <w:p>
+      <w:pPr>
+        <w:rPr>
+          <w:color w:val="3576F9"/>
+        </w:rPr>
+      </w:pPr>
+    </w:p>
+    <w:p>
+      <w:pPr>
+        <w:pStyle w:val="NoSpacing"/>
+        <w:rPr>
+          <w:color w:val="7030A0"/>
+          <w:lang w:val="it-IT"/>
+        </w:rPr>
+      </w:pPr>
+      <w:r>
+        <w:rPr>
+          <w:color w:val="7030A0"/>
+          <w:lang w:val="it-IT"/>
+        </w:rPr>
+        <w:t>echo "tis_gap_app.ini" &gt;&gt; .gitignore</w:t>
+      </w:r>
+    </w:p>
+    <w:p>
+      <w:pPr>
+        <w:pStyle w:val="NoSpacing"/>
+        <w:rPr>
+          <w:color w:val="7030A0"/>
+        </w:rPr>
+      </w:pPr>
+      <w:r>
+        <w:rPr>
+          <w:color w:val="7030A0"/>
+        </w:rPr>
+        <w:t xml:space="preserve">git rm --cached </w:t>
+      </w:r>
+      <w:proofErr w:type="spellStart"/>
+      <w:r>
+        <w:rPr>
+          <w:color w:val="7030A0"/>
+        </w:rPr>
+        <w:t>tis_gap_app</w:t>
+      </w:r>
+      <w:proofErr w:type="spellEnd"/>
+      <w:r>
+        <w:rPr>
+          <w:color w:val="7030A0"/>
+        </w:rPr>
+        <w:t>/tis_gap_app.ini</w:t>
+      </w:r>
+    </w:p>
+    <w:p>
+      <w:pPr>
+        <w:pStyle w:val="NoSpacing"/>
+        <w:rPr>
+          <w:color w:val="7030A0"/>
+        </w:rPr>
+      </w:pPr>
+      <w:r>
+        <w:rPr>
+          <w:color w:val="7030A0"/>
+        </w:rPr>
+        <w:t>git add .</w:t>
+      </w:r>
+      <w:proofErr w:type="spellStart"/>
+      <w:r>
+        <w:rPr>
+          <w:color w:val="7030A0"/>
+        </w:rPr>
+        <w:t>gitignore</w:t>
+      </w:r>
+      <w:proofErr w:type="spellEnd"/>
+    </w:p>
+    <w:p>
+      <w:pPr>
+        <w:pStyle w:val="NoSpacing"/>
+        <w:rPr>
+          <w:color w:val="7030A0"/>
+        </w:rPr>
+      </w:pPr>
+      <w:r>
+        <w:rPr>
+          <w:color w:val="7030A0"/>
+        </w:rPr>
+        <w:t xml:space="preserve">git commit -m "remove </w:t>
+      </w:r>
+      <w:proofErr w:type="spellStart"/>
+      <w:r>
+        <w:rPr>
+          <w:color w:val="7030A0"/>
+        </w:rPr>
+        <w:t>ini</w:t>
+      </w:r>
+      <w:proofErr w:type="spellEnd"/>
+      <w:r>
+        <w:rPr>
+          <w:color w:val="7030A0"/>
+        </w:rPr>
+        <w:t xml:space="preserve"> file from tracking - contains secrets"</w:t>
+      </w:r>
+    </w:p>
+    <w:p>
+      <w:pPr>
+        <w:pStyle w:val="NoSpacing"/>
+        <w:rPr>
+          <w:color w:val="7030A0"/>
+        </w:rPr>
+      </w:pPr>
+      <w:r>
+        <w:rPr>
+          <w:color w:val="7030A0"/>
+        </w:rPr>
+        <w:t>git filter-branch --force --index-filter "git rm --cached --ignore-</w:t>
+      </w:r>
+      <w:proofErr w:type="spellStart"/>
+      <w:r>
+        <w:rPr>
+          <w:color w:val="7030A0"/>
+        </w:rPr>
+        <w:t>unmatch</w:t>
+      </w:r>
+      <w:proofErr w:type="spellEnd"/>
+      <w:r>
+        <w:rPr>
+          <w:color w:val="7030A0"/>
+        </w:rPr>
+        <w:t xml:space="preserve"> </w:t>
+      </w:r>
+      <w:proofErr w:type="spellStart"/>
+      <w:r>
+        <w:rPr>
+          <w:color w:val="7030A0"/>
+        </w:rPr>
+        <w:t>tis_gap_app</w:t>
+      </w:r>
+      <w:proofErr w:type="spellEnd"/>
+      <w:r>
+        <w:rPr>
+          <w:color w:val="7030A0"/>
+        </w:rPr>
+        <w:t>/tis_gap_app.ini" --prune-empty --tag-name-filter cat -- --all</w:t>
+      </w:r>
+    </w:p>
+    <w:p>
+      <w:pPr>
+        <w:pStyle w:val="NoSpacing"/>
+        <w:rPr>
+          <w:color w:val="7030A0"/>
+        </w:rPr>
+      </w:pPr>
+    </w:p>
+    <w:p>
+      <w:pPr>
+        <w:pStyle w:val="NoSpacing"/>
+        <w:rPr>
+          <w:color w:val="7030A0"/>
+        </w:rPr>
+      </w:pPr>
+      <w:r>
+        <w:rPr>
+          <w:color w:val="7030A0"/>
+        </w:rPr>
+        <w:t>git push origin dev --force</w:t>
       </w:r>
     </w:p>
     <w:sectPr>
@@ -669,7 +903,6 @@
   <w:style w:type="character" w:default="1" w:styleId="DefaultParagraphFont">
     <w:name w:val="Default Paragraph Font"/>
     <w:uiPriority w:val="1"/>
-    <w:semiHidden/>
     <w:unhideWhenUsed/>
   </w:style>
   <w:style w:type="table" w:default="1" w:styleId="TableNormal">
@@ -982,6 +1215,15 @@
       <w:color w:val="0F4761" w:themeColor="accent1" w:themeShade="BF"/>
       <w:spacing w:val="5"/>
     </w:rPr>
+  </w:style>
+  <w:style w:type="paragraph" w:styleId="NoSpacing">
+    <w:name w:val="No Spacing"/>
+    <w:uiPriority w:val="1"/>
+    <w:qFormat/>
+    <w:rsid w:val="00786C6D"/>
+    <w:pPr>
+      <w:spacing w:after="0" w:line="240" w:lineRule="auto"/>
+    </w:pPr>
   </w:style>
 </w:styles>
 </file>

</xml_diff>